<commit_message>
Ajustes git add -A
</commit_message>
<xml_diff>
--- a/docs/Articulo_IEEE_Final.docx
+++ b/docs/Articulo_IEEE_Final.docx
@@ -14,27 +14,7 @@
           <w:sz w:val="48"/>
           <w:szCs w:val="48"/>
         </w:rPr>
-        <w:t xml:space="preserve">Clasificación de Reseñas de Hoteles en </w:t>
-      </w:r>
-      <w:proofErr w:type="gramStart"/>
-      <w:r>
-        <w:rPr>
-          <w:b/>
-          <w:bCs/>
-          <w:sz w:val="48"/>
-          <w:szCs w:val="48"/>
-        </w:rPr>
-        <w:t>Español</w:t>
-      </w:r>
-      <w:proofErr w:type="gramEnd"/>
-      <w:r>
-        <w:rPr>
-          <w:b/>
-          <w:bCs/>
-          <w:sz w:val="48"/>
-          <w:szCs w:val="48"/>
-        </w:rPr>
-        <w:t xml:space="preserve"> mediante Redes Neuronales Recurrentes con Atención: Un Estudio Comparativo</w:t>
+        <w:t>Clasificación de Reseñas de Hoteles en Español mediante Redes Neuronales Recurrentes con Atención: Un Estudio Comparativo</w:t>
       </w:r>
     </w:p>
     <w:p>
@@ -130,28 +110,54 @@
       <w:r>
         <w:t xml:space="preserve"> </w:t>
       </w:r>
-      <w:proofErr w:type="spellStart"/>
-      <w:r>
+      <w:r>
+        <w:t>“</w:t>
+      </w:r>
+      <w:proofErr w:type="spellStart"/>
+      <w:r>
+        <w:rPr>
+          <w:i/>
+          <w:iCs/>
+        </w:rPr>
         <w:t>Andalusian</w:t>
       </w:r>
       <w:proofErr w:type="spellEnd"/>
       <w:r>
+        <w:rPr>
+          <w:i/>
+          <w:iCs/>
+        </w:rPr>
         <w:t xml:space="preserve"> </w:t>
       </w:r>
       <w:proofErr w:type="spellStart"/>
       <w:r>
+        <w:rPr>
+          <w:i/>
+          <w:iCs/>
+        </w:rPr>
         <w:t>Hotels</w:t>
       </w:r>
       <w:proofErr w:type="spellEnd"/>
       <w:r>
+        <w:rPr>
+          <w:i/>
+          <w:iCs/>
+        </w:rPr>
         <w:t xml:space="preserve"> </w:t>
       </w:r>
       <w:proofErr w:type="spellStart"/>
       <w:r>
+        <w:rPr>
+          <w:i/>
+          <w:iCs/>
+        </w:rPr>
         <w:t>Reviews</w:t>
       </w:r>
       <w:proofErr w:type="spellEnd"/>
       <w:r>
+        <w:t>”</w:t>
+      </w:r>
+      <w:r>
         <w:t xml:space="preserve">, un corpus de 18,172 reseñas etiquetadas con ratings de 1 a 5 estrellas que presenta un desbalance severo (ratio 9.1:1). Se implementan y evalúan: (1) un LSTM unidireccional como línea base, (2) una </w:t>
       </w:r>
       <w:proofErr w:type="spellStart"/>
@@ -210,19 +216,9 @@
       <w:r>
         <w:t xml:space="preserve">, entrenado desde cero, logra un rendimiento competitivo frente a BETO (diferencia de solo 3.7 puntos de F1 macro), destacando el valor de los mecanismos de atención para capturar patrones lingüísticos relevantes en análisis de sentimiento. El manejo del desbalance de clases mediante </w:t>
       </w:r>
-      <w:proofErr w:type="spellStart"/>
-      <w:r>
-        <w:t>class</w:t>
-      </w:r>
-      <w:proofErr w:type="spellEnd"/>
-      <w:r>
-        <w:t xml:space="preserve"> </w:t>
-      </w:r>
-      <w:proofErr w:type="spellStart"/>
-      <w:r>
-        <w:t>weights</w:t>
-      </w:r>
-      <w:proofErr w:type="spellEnd"/>
+      <w:r>
+        <w:t>los pesos de clases</w:t>
+      </w:r>
       <w:r>
         <w:t xml:space="preserve"> muestra un efecto variable según la arquitectura, siendo crucial para el modelo combinado pero contraproducente para los modelos más simples.</w:t>
       </w:r>
@@ -244,7 +240,13 @@
       </w:r>
       <w:proofErr w:type="spellEnd"/>
       <w:r>
-        <w:t xml:space="preserve">—análisis de sentimiento, LSTM, </w:t>
+        <w:t>—análisis de sentimiento</w:t>
+      </w:r>
+      <w:r>
+        <w:t>s</w:t>
+      </w:r>
+      <w:r>
+        <w:t xml:space="preserve">, LSTM, </w:t>
       </w:r>
       <w:proofErr w:type="spellStart"/>
       <w:r>
@@ -437,11 +439,9 @@
       <w:r>
         <w:t xml:space="preserve"> en español, un idioma </w:t>
       </w:r>
-      <w:proofErr w:type="spellStart"/>
-      <w:r>
-        <w:t>sub-representado</w:t>
-      </w:r>
-      <w:proofErr w:type="spellEnd"/>
+      <w:r>
+        <w:t>a veces poco representado</w:t>
+      </w:r>
       <w:r>
         <w:t xml:space="preserve"> en la literatura de NLP [9].</w:t>
       </w:r>
@@ -465,7 +465,13 @@
         <w:jc w:val="both"/>
       </w:pPr>
       <w:r>
-        <w:t>El objetivo general de este trabajo es diseñar, implementar y comparar múltiples arquitecturas de aprendizaje profundo para la clasificación de reseñas de hoteles en español en 5 niveles de satisfacción.</w:t>
+        <w:t>El objetivo general de este trabajo es</w:t>
+      </w:r>
+      <w:r>
+        <w:t>: D</w:t>
+      </w:r>
+      <w:r>
+        <w:t>iseñar, implementar y comparar múltiples arquitecturas de aprendizaje profundo para la clasificación de reseñas de hoteles en español en 5 niveles de satisfacción.</w:t>
       </w:r>
     </w:p>
     <w:p>
@@ -745,12 +751,6 @@
         <w:gridCol w:w="1509"/>
       </w:tblGrid>
       <w:tr>
-        <w:tblPrEx>
-          <w:tblCellMar>
-            <w:top w:w="0" w:type="dxa"/>
-            <w:bottom w:w="0" w:type="dxa"/>
-          </w:tblCellMar>
-        </w:tblPrEx>
         <w:tc>
           <w:tcPr>
             <w:tcW w:w="0" w:type="auto"/>
@@ -883,12 +883,6 @@
         </w:tc>
       </w:tr>
       <w:tr>
-        <w:tblPrEx>
-          <w:tblCellMar>
-            <w:top w:w="0" w:type="dxa"/>
-            <w:bottom w:w="0" w:type="dxa"/>
-          </w:tblCellMar>
-        </w:tblPrEx>
         <w:tc>
           <w:tcPr>
             <w:tcW w:w="0" w:type="auto"/>
@@ -981,12 +975,6 @@
         </w:tc>
       </w:tr>
       <w:tr>
-        <w:tblPrEx>
-          <w:tblCellMar>
-            <w:top w:w="0" w:type="dxa"/>
-            <w:bottom w:w="0" w:type="dxa"/>
-          </w:tblCellMar>
-        </w:tblPrEx>
         <w:tc>
           <w:tcPr>
             <w:tcW w:w="0" w:type="auto"/>
@@ -1079,12 +1067,6 @@
         </w:tc>
       </w:tr>
       <w:tr>
-        <w:tblPrEx>
-          <w:tblCellMar>
-            <w:top w:w="0" w:type="dxa"/>
-            <w:bottom w:w="0" w:type="dxa"/>
-          </w:tblCellMar>
-        </w:tblPrEx>
         <w:tc>
           <w:tcPr>
             <w:tcW w:w="0" w:type="auto"/>
@@ -1177,12 +1159,6 @@
         </w:tc>
       </w:tr>
       <w:tr>
-        <w:tblPrEx>
-          <w:tblCellMar>
-            <w:top w:w="0" w:type="dxa"/>
-            <w:bottom w:w="0" w:type="dxa"/>
-          </w:tblCellMar>
-        </w:tblPrEx>
         <w:tc>
           <w:tcPr>
             <w:tcW w:w="0" w:type="auto"/>
@@ -1275,12 +1251,6 @@
         </w:tc>
       </w:tr>
       <w:tr>
-        <w:tblPrEx>
-          <w:tblCellMar>
-            <w:top w:w="0" w:type="dxa"/>
-            <w:bottom w:w="0" w:type="dxa"/>
-          </w:tblCellMar>
-        </w:tblPrEx>
         <w:tc>
           <w:tcPr>
             <w:tcW w:w="0" w:type="auto"/>
@@ -1398,12 +1368,10 @@
         <w:t xml:space="preserve">El desbalance es severo (ratio 9.1:1). Un clasificador trivial que prediga siempre la clase mayoritaria alcanzaría ~50% de </w:t>
       </w:r>
       <w:proofErr w:type="spellStart"/>
-      <w:proofErr w:type="gramStart"/>
       <w:r>
         <w:t>accuracy</w:t>
       </w:r>
       <w:proofErr w:type="spellEnd"/>
-      <w:proofErr w:type="gramEnd"/>
       <w:r>
         <w:t xml:space="preserve"> pero un F1 macro cercano a 0.10.</w:t>
       </w:r>
@@ -1618,7 +1586,13 @@
         <w:t>Tildes preservadas:</w:t>
       </w:r>
       <w:r>
-        <w:t xml:space="preserve"> "más" (conjunción) vs "más" (adverbio de cantidad) son semánticamente diferentes en español.</w:t>
+        <w:t xml:space="preserve"> "m</w:t>
+      </w:r>
+      <w:r>
+        <w:t>a</w:t>
+      </w:r>
+      <w:r>
+        <w:t>s" (conjunción) vs "más" (adverbio de cantidad) son semánticamente diferentes en español.</w:t>
       </w:r>
     </w:p>
     <w:p>
@@ -2037,7 +2011,6 @@
         <w:ind w:left="288"/>
       </w:pPr>
       <w:proofErr w:type="spellStart"/>
-      <w:proofErr w:type="gramStart"/>
       <w:r>
         <w:rPr>
           <w:rFonts w:ascii="Courier New" w:eastAsia="Courier New" w:hAnsi="Courier New" w:cs="Courier New"/>
@@ -2053,16 +2026,7 @@
           <w:sz w:val="16"/>
           <w:szCs w:val="16"/>
         </w:rPr>
-        <w:t>(</w:t>
-      </w:r>
-      <w:proofErr w:type="gramEnd"/>
-      <w:r>
-        <w:rPr>
-          <w:rFonts w:ascii="Courier New" w:eastAsia="Courier New" w:hAnsi="Courier New" w:cs="Courier New"/>
-          <w:sz w:val="16"/>
-          <w:szCs w:val="16"/>
-        </w:rPr>
-        <w:t xml:space="preserve">20,002, 128, </w:t>
+        <w:t xml:space="preserve">(20,002, 128, </w:t>
       </w:r>
       <w:proofErr w:type="spellStart"/>
       <w:r>
@@ -2094,25 +2058,7 @@
           <w:sz w:val="16"/>
           <w:szCs w:val="16"/>
         </w:rPr>
-        <w:t xml:space="preserve">  → </w:t>
-      </w:r>
-      <w:proofErr w:type="gramStart"/>
-      <w:r>
-        <w:rPr>
-          <w:rFonts w:ascii="Courier New" w:eastAsia="Courier New" w:hAnsi="Courier New" w:cs="Courier New"/>
-          <w:sz w:val="16"/>
-          <w:szCs w:val="16"/>
-        </w:rPr>
-        <w:t>LSTM(</w:t>
-      </w:r>
-      <w:proofErr w:type="gramEnd"/>
-      <w:r>
-        <w:rPr>
-          <w:rFonts w:ascii="Courier New" w:eastAsia="Courier New" w:hAnsi="Courier New" w:cs="Courier New"/>
-          <w:sz w:val="16"/>
-          <w:szCs w:val="16"/>
-        </w:rPr>
-        <w:t xml:space="preserve">128 </w:t>
+        <w:t xml:space="preserve">  → LSTM(128 </w:t>
       </w:r>
       <w:proofErr w:type="spellStart"/>
       <w:r>
@@ -2204,25 +2150,7 @@
           <w:sz w:val="16"/>
           <w:szCs w:val="16"/>
         </w:rPr>
-        <w:t xml:space="preserve">  → </w:t>
-      </w:r>
-      <w:proofErr w:type="gramStart"/>
-      <w:r>
-        <w:rPr>
-          <w:rFonts w:ascii="Courier New" w:eastAsia="Courier New" w:hAnsi="Courier New" w:cs="Courier New"/>
-          <w:sz w:val="16"/>
-          <w:szCs w:val="16"/>
-        </w:rPr>
-        <w:t>Dense(</w:t>
-      </w:r>
-      <w:proofErr w:type="gramEnd"/>
-      <w:r>
-        <w:rPr>
-          <w:rFonts w:ascii="Courier New" w:eastAsia="Courier New" w:hAnsi="Courier New" w:cs="Courier New"/>
-          <w:sz w:val="16"/>
-          <w:szCs w:val="16"/>
-        </w:rPr>
-        <w:t xml:space="preserve">128 → 64, </w:t>
+        <w:t xml:space="preserve">  → Dense(128 → 64, </w:t>
       </w:r>
       <w:proofErr w:type="spellStart"/>
       <w:r>
@@ -2257,7 +2185,6 @@
         <w:t xml:space="preserve">  → </w:t>
       </w:r>
       <w:proofErr w:type="spellStart"/>
-      <w:proofErr w:type="gramStart"/>
       <w:r>
         <w:rPr>
           <w:rFonts w:ascii="Courier New" w:eastAsia="Courier New" w:hAnsi="Courier New" w:cs="Courier New"/>
@@ -2273,16 +2200,7 @@
           <w:sz w:val="16"/>
           <w:szCs w:val="16"/>
         </w:rPr>
-        <w:t>(</w:t>
-      </w:r>
-      <w:proofErr w:type="gramEnd"/>
-      <w:r>
-        <w:rPr>
-          <w:rFonts w:ascii="Courier New" w:eastAsia="Courier New" w:hAnsi="Courier New" w:cs="Courier New"/>
-          <w:sz w:val="16"/>
-          <w:szCs w:val="16"/>
-        </w:rPr>
-        <w:t>0.3)</w:t>
+        <w:t>(0.3)</w:t>
       </w:r>
     </w:p>
     <w:p>
@@ -2296,25 +2214,7 @@
           <w:sz w:val="16"/>
           <w:szCs w:val="16"/>
         </w:rPr>
-        <w:t xml:space="preserve">  → </w:t>
-      </w:r>
-      <w:proofErr w:type="gramStart"/>
-      <w:r>
-        <w:rPr>
-          <w:rFonts w:ascii="Courier New" w:eastAsia="Courier New" w:hAnsi="Courier New" w:cs="Courier New"/>
-          <w:sz w:val="16"/>
-          <w:szCs w:val="16"/>
-        </w:rPr>
-        <w:t>Dense(</w:t>
-      </w:r>
-      <w:proofErr w:type="gramEnd"/>
-      <w:r>
-        <w:rPr>
-          <w:rFonts w:ascii="Courier New" w:eastAsia="Courier New" w:hAnsi="Courier New" w:cs="Courier New"/>
-          <w:sz w:val="16"/>
-          <w:szCs w:val="16"/>
-        </w:rPr>
-        <w:t>64 → 5)</w:t>
+        <w:t xml:space="preserve">  → Dense(64 → 5)</w:t>
       </w:r>
     </w:p>
     <w:p>
@@ -2481,7 +2381,6 @@
         <w:ind w:left="288"/>
       </w:pPr>
       <w:proofErr w:type="spellStart"/>
-      <w:proofErr w:type="gramStart"/>
       <w:r>
         <w:rPr>
           <w:rFonts w:ascii="Courier New" w:eastAsia="Courier New" w:hAnsi="Courier New" w:cs="Courier New"/>
@@ -2497,16 +2396,7 @@
           <w:sz w:val="16"/>
           <w:szCs w:val="16"/>
         </w:rPr>
-        <w:t>(</w:t>
-      </w:r>
-      <w:proofErr w:type="gramEnd"/>
-      <w:r>
-        <w:rPr>
-          <w:rFonts w:ascii="Courier New" w:eastAsia="Courier New" w:hAnsi="Courier New" w:cs="Courier New"/>
-          <w:sz w:val="16"/>
-          <w:szCs w:val="16"/>
-        </w:rPr>
-        <w:t xml:space="preserve">20,002, 128, </w:t>
+        <w:t xml:space="preserve">(20,002, 128, </w:t>
       </w:r>
       <w:proofErr w:type="spellStart"/>
       <w:r>
@@ -2541,7 +2431,6 @@
         <w:t xml:space="preserve">  → </w:t>
       </w:r>
       <w:proofErr w:type="spellStart"/>
-      <w:proofErr w:type="gramStart"/>
       <w:r>
         <w:rPr>
           <w:rFonts w:ascii="Courier New" w:eastAsia="Courier New" w:hAnsi="Courier New" w:cs="Courier New"/>
@@ -2557,16 +2446,7 @@
           <w:sz w:val="16"/>
           <w:szCs w:val="16"/>
         </w:rPr>
-        <w:t>(</w:t>
-      </w:r>
-      <w:proofErr w:type="gramEnd"/>
-      <w:r>
-        <w:rPr>
-          <w:rFonts w:ascii="Courier New" w:eastAsia="Courier New" w:hAnsi="Courier New" w:cs="Courier New"/>
-          <w:sz w:val="16"/>
-          <w:szCs w:val="16"/>
-        </w:rPr>
-        <w:t xml:space="preserve">128/dirección, 2 capas, </w:t>
+        <w:t xml:space="preserve">(128/dirección, 2 capas, </w:t>
       </w:r>
       <w:proofErr w:type="spellStart"/>
       <w:r>
@@ -2615,7 +2495,6 @@
         <w:t xml:space="preserve">  → </w:t>
       </w:r>
       <w:proofErr w:type="spellStart"/>
-      <w:proofErr w:type="gramStart"/>
       <w:r>
         <w:rPr>
           <w:rFonts w:ascii="Courier New" w:eastAsia="Courier New" w:hAnsi="Courier New" w:cs="Courier New"/>
@@ -2631,16 +2510,7 @@
           <w:sz w:val="16"/>
           <w:szCs w:val="16"/>
         </w:rPr>
-        <w:t>(</w:t>
-      </w:r>
-      <w:proofErr w:type="gramEnd"/>
-      <w:r>
-        <w:rPr>
-          <w:rFonts w:ascii="Courier New" w:eastAsia="Courier New" w:hAnsi="Courier New" w:cs="Courier New"/>
-          <w:sz w:val="16"/>
-          <w:szCs w:val="16"/>
-        </w:rPr>
-        <w:t>0.4)</w:t>
+        <w:t>(0.4)</w:t>
       </w:r>
     </w:p>
     <w:p>
@@ -2654,25 +2524,7 @@
           <w:sz w:val="16"/>
           <w:szCs w:val="16"/>
         </w:rPr>
-        <w:t xml:space="preserve">  → </w:t>
-      </w:r>
-      <w:proofErr w:type="gramStart"/>
-      <w:r>
-        <w:rPr>
-          <w:rFonts w:ascii="Courier New" w:eastAsia="Courier New" w:hAnsi="Courier New" w:cs="Courier New"/>
-          <w:sz w:val="16"/>
-          <w:szCs w:val="16"/>
-        </w:rPr>
-        <w:t>Dense(</w:t>
-      </w:r>
-      <w:proofErr w:type="gramEnd"/>
-      <w:r>
-        <w:rPr>
-          <w:rFonts w:ascii="Courier New" w:eastAsia="Courier New" w:hAnsi="Courier New" w:cs="Courier New"/>
-          <w:sz w:val="16"/>
-          <w:szCs w:val="16"/>
-        </w:rPr>
-        <w:t xml:space="preserve">256 → 128, </w:t>
+        <w:t xml:space="preserve">  → Dense(256 → 128, </w:t>
       </w:r>
       <w:proofErr w:type="spellStart"/>
       <w:r>
@@ -2704,25 +2556,7 @@
           <w:sz w:val="16"/>
           <w:szCs w:val="16"/>
         </w:rPr>
-        <w:t xml:space="preserve">  → </w:t>
-      </w:r>
-      <w:proofErr w:type="gramStart"/>
-      <w:r>
-        <w:rPr>
-          <w:rFonts w:ascii="Courier New" w:eastAsia="Courier New" w:hAnsi="Courier New" w:cs="Courier New"/>
-          <w:sz w:val="16"/>
-          <w:szCs w:val="16"/>
-        </w:rPr>
-        <w:t>Dense(</w:t>
-      </w:r>
-      <w:proofErr w:type="gramEnd"/>
-      <w:r>
-        <w:rPr>
-          <w:rFonts w:ascii="Courier New" w:eastAsia="Courier New" w:hAnsi="Courier New" w:cs="Courier New"/>
-          <w:sz w:val="16"/>
-          <w:szCs w:val="16"/>
-        </w:rPr>
-        <w:t>128 → 5)</w:t>
+        <w:t xml:space="preserve">  → Dense(128 → 5)</w:t>
       </w:r>
     </w:p>
     <w:p>
@@ -2963,7 +2797,6 @@
         <w:ind w:left="288"/>
       </w:pPr>
       <w:proofErr w:type="spellStart"/>
-      <w:proofErr w:type="gramStart"/>
       <w:r>
         <w:rPr>
           <w:rFonts w:ascii="Courier New" w:eastAsia="Courier New" w:hAnsi="Courier New" w:cs="Courier New"/>
@@ -2979,16 +2812,7 @@
           <w:sz w:val="16"/>
           <w:szCs w:val="16"/>
         </w:rPr>
-        <w:t>(</w:t>
-      </w:r>
-      <w:proofErr w:type="gramEnd"/>
-      <w:r>
-        <w:rPr>
-          <w:rFonts w:ascii="Courier New" w:eastAsia="Courier New" w:hAnsi="Courier New" w:cs="Courier New"/>
-          <w:sz w:val="16"/>
-          <w:szCs w:val="16"/>
-        </w:rPr>
-        <w:t xml:space="preserve">20,002, 128, </w:t>
+        <w:t xml:space="preserve">(20,002, 128, </w:t>
       </w:r>
       <w:proofErr w:type="spellStart"/>
       <w:r>
@@ -3023,7 +2847,6 @@
         <w:t xml:space="preserve">  → </w:t>
       </w:r>
       <w:proofErr w:type="spellStart"/>
-      <w:proofErr w:type="gramStart"/>
       <w:r>
         <w:rPr>
           <w:rFonts w:ascii="Courier New" w:eastAsia="Courier New" w:hAnsi="Courier New" w:cs="Courier New"/>
@@ -3039,16 +2862,7 @@
           <w:sz w:val="16"/>
           <w:szCs w:val="16"/>
         </w:rPr>
-        <w:t>(</w:t>
-      </w:r>
-      <w:proofErr w:type="gramEnd"/>
-      <w:r>
-        <w:rPr>
-          <w:rFonts w:ascii="Courier New" w:eastAsia="Courier New" w:hAnsi="Courier New" w:cs="Courier New"/>
-          <w:sz w:val="16"/>
-          <w:szCs w:val="16"/>
-        </w:rPr>
-        <w:t>0.4)</w:t>
+        <w:t>(0.4)</w:t>
       </w:r>
     </w:p>
     <w:p>
@@ -3065,7 +2879,6 @@
         <w:t xml:space="preserve">  → </w:t>
       </w:r>
       <w:proofErr w:type="spellStart"/>
-      <w:proofErr w:type="gramStart"/>
       <w:r>
         <w:rPr>
           <w:rFonts w:ascii="Courier New" w:eastAsia="Courier New" w:hAnsi="Courier New" w:cs="Courier New"/>
@@ -3081,16 +2894,7 @@
           <w:sz w:val="16"/>
           <w:szCs w:val="16"/>
         </w:rPr>
-        <w:t>(</w:t>
-      </w:r>
-      <w:proofErr w:type="gramEnd"/>
-      <w:r>
-        <w:rPr>
-          <w:rFonts w:ascii="Courier New" w:eastAsia="Courier New" w:hAnsi="Courier New" w:cs="Courier New"/>
-          <w:sz w:val="16"/>
-          <w:szCs w:val="16"/>
-        </w:rPr>
-        <w:t xml:space="preserve">256/dirección, 2 capas, </w:t>
+        <w:t xml:space="preserve">(256/dirección, 2 capas, </w:t>
       </w:r>
       <w:proofErr w:type="spellStart"/>
       <w:r>
@@ -3225,7 +3029,6 @@
         <w:t xml:space="preserve">  → </w:t>
       </w:r>
       <w:proofErr w:type="spellStart"/>
-      <w:proofErr w:type="gramStart"/>
       <w:r>
         <w:rPr>
           <w:rFonts w:ascii="Courier New" w:eastAsia="Courier New" w:hAnsi="Courier New" w:cs="Courier New"/>
@@ -3241,16 +3044,7 @@
           <w:sz w:val="16"/>
           <w:szCs w:val="16"/>
         </w:rPr>
-        <w:t>(</w:t>
-      </w:r>
-      <w:proofErr w:type="gramEnd"/>
-      <w:r>
-        <w:rPr>
-          <w:rFonts w:ascii="Courier New" w:eastAsia="Courier New" w:hAnsi="Courier New" w:cs="Courier New"/>
-          <w:sz w:val="16"/>
-          <w:szCs w:val="16"/>
-        </w:rPr>
-        <w:t>0.4)</w:t>
+        <w:t>(0.4)</w:t>
       </w:r>
     </w:p>
     <w:p>
@@ -3264,25 +3058,7 @@
           <w:sz w:val="16"/>
           <w:szCs w:val="16"/>
         </w:rPr>
-        <w:t xml:space="preserve">  → </w:t>
-      </w:r>
-      <w:proofErr w:type="gramStart"/>
-      <w:r>
-        <w:rPr>
-          <w:rFonts w:ascii="Courier New" w:eastAsia="Courier New" w:hAnsi="Courier New" w:cs="Courier New"/>
-          <w:sz w:val="16"/>
-          <w:szCs w:val="16"/>
-        </w:rPr>
-        <w:t>Dense(</w:t>
-      </w:r>
-      <w:proofErr w:type="gramEnd"/>
-      <w:r>
-        <w:rPr>
-          <w:rFonts w:ascii="Courier New" w:eastAsia="Courier New" w:hAnsi="Courier New" w:cs="Courier New"/>
-          <w:sz w:val="16"/>
-          <w:szCs w:val="16"/>
-        </w:rPr>
-        <w:t xml:space="preserve">512 → 256, </w:t>
+        <w:t xml:space="preserve">  → Dense(512 → 256, </w:t>
       </w:r>
       <w:proofErr w:type="spellStart"/>
       <w:r>
@@ -3314,25 +3090,7 @@
           <w:sz w:val="16"/>
           <w:szCs w:val="16"/>
         </w:rPr>
-        <w:t xml:space="preserve">  → </w:t>
-      </w:r>
-      <w:proofErr w:type="gramStart"/>
-      <w:r>
-        <w:rPr>
-          <w:rFonts w:ascii="Courier New" w:eastAsia="Courier New" w:hAnsi="Courier New" w:cs="Courier New"/>
-          <w:sz w:val="16"/>
-          <w:szCs w:val="16"/>
-        </w:rPr>
-        <w:t>Dense(</w:t>
-      </w:r>
-      <w:proofErr w:type="gramEnd"/>
-      <w:r>
-        <w:rPr>
-          <w:rFonts w:ascii="Courier New" w:eastAsia="Courier New" w:hAnsi="Courier New" w:cs="Courier New"/>
-          <w:sz w:val="16"/>
-          <w:szCs w:val="16"/>
-        </w:rPr>
-        <w:t>256 → 5)</w:t>
+        <w:t xml:space="preserve">  → Dense(256 → 5)</w:t>
       </w:r>
     </w:p>
     <w:p>
@@ -3352,12 +3110,10 @@
         <w:t xml:space="preserve"> utiliza </w:t>
       </w:r>
       <w:proofErr w:type="spellStart"/>
-      <w:proofErr w:type="gramStart"/>
       <w:r>
         <w:t>nn.MultiheadAttention</w:t>
       </w:r>
       <w:proofErr w:type="spellEnd"/>
-      <w:proofErr w:type="gramEnd"/>
       <w:r>
         <w:t xml:space="preserve"> con 4 cabezas, donde cada cabeza puede aprender a enfocarse en un aspecto lingüístico diferente (negaciones, adjetivos de valoración, sustantivos de dominio, modificadores de intensidad). La salida se agrega mediante </w:t>
       </w:r>
@@ -3557,7 +3313,10 @@
         <w:jc w:val="both"/>
       </w:pPr>
       <w:r>
-        <w:t xml:space="preserve">Se utilizó BETO </w:t>
+        <w:t>En una tarea adicional de investigación, s</w:t>
+      </w:r>
+      <w:r>
+        <w:t xml:space="preserve">e utilizó BETO </w:t>
       </w:r>
       <w:proofErr w:type="spellStart"/>
       <w:r>
@@ -3630,6 +3389,17 @@
       <w:proofErr w:type="spellEnd"/>
       <w:r>
         <w:t xml:space="preserve"> y el clasificador, representando el 7.0% de los parámetros totales.</w:t>
+      </w:r>
+      <w:r>
+        <w:t xml:space="preserve">  Esta tarea se realizó con el único propósito de comparar un </w:t>
+      </w:r>
+      <w:proofErr w:type="spellStart"/>
+      <w:r>
+        <w:t>transformer</w:t>
+      </w:r>
+      <w:proofErr w:type="spellEnd"/>
+      <w:r>
+        <w:t xml:space="preserve"> contra los modelos tradicionales. </w:t>
       </w:r>
     </w:p>
     <w:p>
@@ -3777,6 +3547,21 @@
     </w:p>
     <w:p>
       <w:pPr>
+        <w:rPr>
+          <w:i/>
+          <w:iCs/>
+        </w:rPr>
+      </w:pPr>
+      <w:r>
+        <w:rPr>
+          <w:i/>
+          <w:iCs/>
+        </w:rPr>
+        <w:br w:type="page"/>
+      </w:r>
+    </w:p>
+    <w:p>
+      <w:pPr>
         <w:spacing w:before="180" w:after="60"/>
         <w:ind w:firstLine="288"/>
       </w:pPr>
@@ -3785,6 +3570,7 @@
           <w:i/>
           <w:iCs/>
         </w:rPr>
+        <w:lastRenderedPageBreak/>
         <w:t>A) Tabla Comparativa</w:t>
       </w:r>
     </w:p>
@@ -3794,15 +3580,7 @@
         <w:jc w:val="both"/>
       </w:pPr>
       <w:r>
-        <w:t xml:space="preserve">La Tabla II presenta los resultados en el conjunto </w:t>
-      </w:r>
-      <w:proofErr w:type="gramStart"/>
-      <w:r>
-        <w:t>de test</w:t>
-      </w:r>
-      <w:proofErr w:type="gramEnd"/>
-      <w:r>
-        <w:t xml:space="preserve"> para las cuatro arquitecturas.</w:t>
+        <w:t>La Tabla II presenta los resultados en el conjunto de test para las cuatro arquitecturas.</w:t>
       </w:r>
     </w:p>
     <w:p>
@@ -3817,7 +3595,6 @@
           <w:sz w:val="16"/>
           <w:szCs w:val="16"/>
         </w:rPr>
-        <w:lastRenderedPageBreak/>
         <w:t>TABLA II. COMPARACIÓN DE RENDIMIENTO DE LOS CUATRO MODELOS</w:t>
       </w:r>
     </w:p>
@@ -3848,12 +3625,6 @@
         <w:gridCol w:w="768"/>
       </w:tblGrid>
       <w:tr>
-        <w:tblPrEx>
-          <w:tblCellMar>
-            <w:top w:w="0" w:type="dxa"/>
-            <w:bottom w:w="0" w:type="dxa"/>
-          </w:tblCellMar>
-        </w:tblPrEx>
         <w:tc>
           <w:tcPr>
             <w:tcW w:w="0" w:type="auto"/>
@@ -4064,12 +3835,6 @@
         </w:tc>
       </w:tr>
       <w:tr>
-        <w:tblPrEx>
-          <w:tblCellMar>
-            <w:top w:w="0" w:type="dxa"/>
-            <w:bottom w:w="0" w:type="dxa"/>
-          </w:tblCellMar>
-        </w:tblPrEx>
         <w:tc>
           <w:tcPr>
             <w:tcW w:w="0" w:type="auto"/>
@@ -4198,12 +3963,6 @@
         </w:tc>
       </w:tr>
       <w:tr>
-        <w:tblPrEx>
-          <w:tblCellMar>
-            <w:top w:w="0" w:type="dxa"/>
-            <w:bottom w:w="0" w:type="dxa"/>
-          </w:tblCellMar>
-        </w:tblPrEx>
         <w:tc>
           <w:tcPr>
             <w:tcW w:w="0" w:type="auto"/>
@@ -4334,12 +4093,6 @@
         </w:tc>
       </w:tr>
       <w:tr>
-        <w:tblPrEx>
-          <w:tblCellMar>
-            <w:top w:w="0" w:type="dxa"/>
-            <w:bottom w:w="0" w:type="dxa"/>
-          </w:tblCellMar>
-        </w:tblPrEx>
         <w:tc>
           <w:tcPr>
             <w:tcW w:w="0" w:type="auto"/>
@@ -4470,12 +4223,6 @@
         </w:tc>
       </w:tr>
       <w:tr>
-        <w:tblPrEx>
-          <w:tblCellMar>
-            <w:top w:w="0" w:type="dxa"/>
-            <w:bottom w:w="0" w:type="dxa"/>
-          </w:tblCellMar>
-        </w:tblPrEx>
         <w:tc>
           <w:tcPr>
             <w:tcW w:w="0" w:type="auto"/>
@@ -4721,12 +4468,6 @@
         <w:gridCol w:w="726"/>
       </w:tblGrid>
       <w:tr>
-        <w:tblPrEx>
-          <w:tblCellMar>
-            <w:top w:w="0" w:type="dxa"/>
-            <w:bottom w:w="0" w:type="dxa"/>
-          </w:tblCellMar>
-        </w:tblPrEx>
         <w:tc>
           <w:tcPr>
             <w:tcW w:w="0" w:type="auto"/>
@@ -4863,12 +4604,6 @@
         </w:tc>
       </w:tr>
       <w:tr>
-        <w:tblPrEx>
-          <w:tblCellMar>
-            <w:top w:w="0" w:type="dxa"/>
-            <w:bottom w:w="0" w:type="dxa"/>
-          </w:tblCellMar>
-        </w:tblPrEx>
         <w:tc>
           <w:tcPr>
             <w:tcW w:w="0" w:type="auto"/>
@@ -4961,12 +4696,6 @@
         </w:tc>
       </w:tr>
       <w:tr>
-        <w:tblPrEx>
-          <w:tblCellMar>
-            <w:top w:w="0" w:type="dxa"/>
-            <w:bottom w:w="0" w:type="dxa"/>
-          </w:tblCellMar>
-        </w:tblPrEx>
         <w:tc>
           <w:tcPr>
             <w:tcW w:w="0" w:type="auto"/>
@@ -5059,12 +4788,6 @@
         </w:tc>
       </w:tr>
       <w:tr>
-        <w:tblPrEx>
-          <w:tblCellMar>
-            <w:top w:w="0" w:type="dxa"/>
-            <w:bottom w:w="0" w:type="dxa"/>
-          </w:tblCellMar>
-        </w:tblPrEx>
         <w:tc>
           <w:tcPr>
             <w:tcW w:w="0" w:type="auto"/>
@@ -5157,12 +4880,6 @@
         </w:tc>
       </w:tr>
       <w:tr>
-        <w:tblPrEx>
-          <w:tblCellMar>
-            <w:top w:w="0" w:type="dxa"/>
-            <w:bottom w:w="0" w:type="dxa"/>
-          </w:tblCellMar>
-        </w:tblPrEx>
         <w:tc>
           <w:tcPr>
             <w:tcW w:w="0" w:type="auto"/>
@@ -5255,12 +4972,6 @@
         </w:tc>
       </w:tr>
       <w:tr>
-        <w:tblPrEx>
-          <w:tblCellMar>
-            <w:top w:w="0" w:type="dxa"/>
-            <w:bottom w:w="0" w:type="dxa"/>
-          </w:tblCellMar>
-        </w:tblPrEx>
         <w:tc>
           <w:tcPr>
             <w:tcW w:w="0" w:type="auto"/>
@@ -5790,7 +5501,13 @@
       </w:r>
       <w:proofErr w:type="spellEnd"/>
       <w:r>
-        <w:t xml:space="preserve"> capturar contexto en ambas direcciones y extraer las activaciones más informativas de toda la secuencia. La mejora más dramática se observa en la clase 4★ (0.022 → 0.572), donde el LSTM colapsaba hacia la clase mayoritaria.</w:t>
+        <w:t xml:space="preserve"> capturar contexto en ambas direcciones y extraer </w:t>
+      </w:r>
+      <w:r>
+        <w:t>información</w:t>
+      </w:r>
+      <w:r>
+        <w:t xml:space="preserve"> de toda la secuencia. La mejora más dramática se observa en la clase 4★ (0.022 → 0.572), donde el LSTM colapsaba hacia la clase mayoritaria.</w:t>
       </w:r>
     </w:p>
     <w:p>
@@ -5921,11 +5638,11 @@
       </w:r>
       <w:proofErr w:type="spellEnd"/>
       <w:r>
-        <w:t xml:space="preserve"> de 109.8M totales), con solo 3.7 puntos de diferencia en F1 macro. Notablemente, el modelo combinado </w:t>
+        <w:t xml:space="preserve"> de 109.8M totales), con solo 3.7 puntos de diferencia en F1 macro. Notablemente, el modelo combinado supera a BETO en la clase 2★ (0.533 vs ~0.386) y en la clase </w:t>
       </w:r>
       <w:r>
         <w:lastRenderedPageBreak/>
-        <w:t xml:space="preserve">supera a BETO en la clase 2★ (0.533 vs ~0.386) y en la clase 1★ (0.756 vs 0.729), lo que sugiere que los </w:t>
+        <w:t xml:space="preserve">1★ (0.756 vs 0.729), lo que sugiere que los </w:t>
       </w:r>
       <w:proofErr w:type="spellStart"/>
       <w:r>
@@ -6014,15 +5731,7 @@
       </w:r>
       <w:proofErr w:type="spellEnd"/>
       <w:r>
-        <w:t xml:space="preserve"> (mejoran </w:t>
-      </w:r>
-      <w:proofErr w:type="gramStart"/>
-      <w:r>
-        <w:t>F1</w:t>
-      </w:r>
-      <w:proofErr w:type="gramEnd"/>
-      <w:r>
-        <w:t xml:space="preserve"> pero reducen </w:t>
+        <w:t xml:space="preserve"> (mejoran F1 pero reducen </w:t>
       </w:r>
       <w:proofErr w:type="spellStart"/>
       <w:r>

</xml_diff>